<commit_message>
Checkpoint 2.1: clarify Supervisor role; add alternative diagram
- Doc: add "Role of the Supervisor" (coordinates rather than creates);
  tighten repository section so the doc fits on 6 pages
- Add alternative diagram (thesis-check-system-design-coordinator.png):
  dashed "one check" boundary with the Supervisor as a coordinator badge.
  The doc and README still use the original diagram until one is chosen.

Co-Authored-By: Claude Opus 5.5 <noreply@anthropic.com>
</commit_message>
<xml_diff>
--- a/docs/Capstone Checkpoint 2.1 - Agent Design Refinement.docx
+++ b/docs/Capstone Checkpoint 2.1 - Agent Design Refinement.docx
@@ -141,6 +141,33 @@
           <w:szCs w:val="21"/>
         </w:rPr>
         <w:t xml:space="preserve">The investor gives a ticker and a plain-language thesis. The Thesis Analyst turns it into 3–5 testable claims, which the investor confirms. Two evidence agents gather filing passages and financial data. A Bull and a Bear advocate argue each claim using only that evidence, and a Fact-Checker verifies every number and quote before the Report Writer produces the verdict. The investor approves or overrides it, and the outcome is saved so the same thesis can be re-checked when the next filing arrives. Figure 1 shows the full design.</w:t>
+      </w:r>
+    </w:p>
+    <w:p>
+      <w:pPr>
+        <w:spacing w:before="0" w:after="120" w:line="276" w:lineRule="auto"/>
+      </w:pPr>
+      <w:r>
+        <w:rPr>
+          <w:rFonts w:ascii="Open Sans" w:hAnsi="Open Sans" w:cs="Open Sans"/>
+          <w:b/>
+          <w:bCs/>
+          <w:color w:val="000000"/>
+          <w:sz w:val="21"/>
+          <w:szCs w:val="21"/>
+        </w:rPr>
+        <w:t xml:space="preserve">Role of the Supervisor. </w:t>
+      </w:r>
+      <w:r>
+        <w:rPr>
+          <w:rFonts w:ascii="Open Sans" w:hAnsi="Open Sans" w:cs="Open Sans"/>
+          <w:b w:val="0"/>
+          <w:bCs w:val="0"/>
+          <w:color w:val="000000"/>
+          <w:sz w:val="21"/>
+          <w:szCs w:val="21"/>
+        </w:rPr>
+        <w:t xml:space="preserve">The Supervisor coordinates rather than creates: the agents are fixed roles, and it decides which one runs next, passes each its part of the run state, and enforces limits.</w:t>
       </w:r>
     </w:p>
     <w:p>
@@ -4217,6 +4244,7 @@
     </w:p>
     <w:p>
       <w:pPr>
+        <w:keepLines/>
         <w:spacing w:before="0" w:after="120" w:line="276" w:lineRule="auto"/>
       </w:pPr>
       <w:r>
@@ -4228,25 +4256,7 @@
           <w:sz w:val="21"/>
           <w:szCs w:val="21"/>
         </w:rPr>
-        <w:t xml:space="preserve">Repository: github.com/mosachde/agentic-ai-real-world-capstone-work. Version v2.1 adds this Module 2 design refinement: the system diagram, the reasoning-loop, memory and tool decisions, and a log of open design considerations still being refined. The next build step is turning the starter baseline into a single ReAct Filing Researcher connected to SEC data, the first measurable upgrade over the baseline.</w:t>
-      </w:r>
-    </w:p>
-    <w:p>
-      <w:pPr>
-        <w:spacing w:before="120" w:after="120" w:line="276" w:lineRule="auto"/>
-      </w:pPr>
-      <w:r>
-        <w:rPr>
-          <w:rFonts w:ascii="Open Sans" w:hAnsi="Open Sans" w:cs="Open Sans"/>
-          <w:b w:val="0"/>
-          <w:bCs w:val="0"/>
-          <w:i/>
-          <w:iCs/>
-          <w:color w:val="404040"/>
-          <w:sz w:val="21"/>
-          <w:szCs w:val="21"/>
-        </w:rPr>
-        <w:t xml:space="preserve">This design will continue to be refined as the agent is built and evaluated in later modules.</w:t>
+        <w:t xml:space="preserve">Repository: github.com/mosachde/agentic-ai-real-world-capstone-work. Version v2.1 adds this design refinement, the system diagram and a log of open design considerations. Next build step: turn the starter baseline into a single ReAct Filing Researcher connected to SEC data, the first measurable upgrade over the baseline.</w:t>
       </w:r>
     </w:p>
     <w:sectPr>

</xml_diff>